<commit_message>
Enhance setup scripts and PDF generation process with browser detection
</commit_message>
<xml_diff>
--- a/output/memos/TheoryY_Memo_MU.docx
+++ b/output/memos/TheoryY_Memo_MU.docx
@@ -1721,6 +1721,7 @@
     </w:pPr>
     <w:rPr>
       <w:bCs w:val="0"/>
+      <w:bCs/>
       <w:rFonts w:ascii="Garamond" w:cs="Garamond" w:hAnsi="Garamond"/>
       <w:sz w:val="32"/>
       <w:szCs w:val="32"/>
@@ -1746,6 +1747,7 @@
     <w:rPr>
       <w:bCs/>
       <w:iCs/>
+      <w:bCs/>
       <w:rFonts w:ascii="Calibri" w:cs="Calibri" w:hAnsi="Calibri"/>
       <w:sz w:val="26"/>
       <w:szCs w:val="26"/>
@@ -1771,6 +1773,8 @@
     <w:rPr>
       <w:bCs w:val="0"/>
       <w:iCs w:val="0"/>
+      <w:bCs/>
+      <w:iCs/>
       <w:rFonts w:ascii="Calibri" w:cs="Calibri" w:hAnsi="Calibri"/>
       <w:sz w:val="22"/>
       <w:szCs w:val="22"/>
@@ -1797,6 +1801,7 @@
     </w:pPr>
     <w:rPr>
       <w:iCs/>
+      <w:bCs/>
       <w:rFonts w:ascii="Calibri" w:cs="Calibri" w:hAnsi="Calibri"/>
       <w:sz w:val="21"/>
       <w:szCs w:val="21"/>
@@ -1818,6 +1823,7 @@
       <w:keepNext/>
     </w:pPr>
     <w:rPr>
+      <w:bCs/>
       <w:rFonts w:ascii="Calibri" w:cs="Calibri" w:hAnsi="Calibri"/>
       <w:sz w:val="21"/>
       <w:szCs w:val="21"/>
@@ -1840,6 +1846,7 @@
     </w:pPr>
     <w:rPr>
       <w:iCs w:val="0"/>
+      <w:bCs/>
       <w:rFonts w:ascii="Calibri" w:cs="Calibri" w:hAnsi="Calibri"/>
       <w:sz w:val="21"/>
       <w:szCs w:val="21"/>
@@ -1954,6 +1961,7 @@
     </w:pPr>
     <w:rPr>
       <w:bCs/>
+      <w:bCs/>
       <w:rFonts w:ascii="Garamond" w:cs="Garamond" w:hAnsi="Garamond"/>
       <w:sz w:val="56"/>
       <w:szCs w:val="56"/>
@@ -1972,6 +1980,7 @@
     <w:rPr>
       <w:bCs/>
       <w:lang w:val="en-GB"/>
+      <w:bCs/>
       <w:rFonts w:ascii="Garamond" w:cs="Garamond" w:hAnsi="Garamond"/>
       <w:sz w:val="56"/>
       <w:szCs w:val="56"/>
@@ -1990,6 +1999,7 @@
     <w:qFormat/>
     <w:rsid w:val="00812908"/>
     <w:rPr>
+      <w:iCs/>
       <w:rFonts w:ascii="Calibri" w:cs="Calibri" w:hAnsi="Calibri"/>
       <w:sz w:val="20"/>
       <w:szCs w:val="20"/>
@@ -2010,6 +2020,7 @@
     <w:rsid w:val="00F80901"/>
     <w:rPr>
       <w:bCs/>
+      <w:iCs/>
       <w:rFonts w:ascii="Calibri" w:cs="Calibri" w:hAnsi="Calibri"/>
       <w:sz w:val="20"/>
       <w:szCs w:val="20"/>
@@ -2025,6 +2036,7 @@
     <w:uiPriority w:val="9"/>
     <w:rsid w:val="00FA3C3A"/>
     <w:rPr>
+      <w:bCs/>
       <w:rFonts w:ascii="Garamond" w:cs="Garamond" w:hAnsi="Garamond"/>
       <w:sz w:val="32"/>
       <w:szCs w:val="32"/>
@@ -2042,6 +2054,7 @@
     <w:rPr>
       <w:bCs/>
       <w:iCs/>
+      <w:bCs/>
       <w:rFonts w:ascii="Calibri" w:cs="Calibri" w:hAnsi="Calibri"/>
       <w:sz w:val="26"/>
       <w:szCs w:val="26"/>
@@ -2057,6 +2070,8 @@
     <w:uiPriority w:val="9"/>
     <w:rsid w:val="00FA3C3A"/>
     <w:rPr>
+      <w:bCs/>
+      <w:iCs/>
       <w:rFonts w:ascii="Calibri" w:cs="Calibri" w:hAnsi="Calibri"/>
       <w:sz w:val="22"/>
       <w:szCs w:val="22"/>
@@ -2170,6 +2185,7 @@
     </w:pPr>
     <w:rPr>
       <w:iCs/>
+      <w:iCs/>
       <w:rFonts w:ascii="Garamond" w:cs="Garamond" w:hAnsi="Garamond"/>
       <w:sz w:val="21"/>
       <w:szCs w:val="21"/>
@@ -2208,6 +2224,8 @@
       </w:pBdr>
     </w:pPr>
     <w:rPr>
+      <w:iCs/>
+      <w:bCs/>
       <w:iCs/>
       <w:rFonts w:ascii="Garamond" w:cs="Garamond" w:hAnsi="Garamond"/>
       <w:sz w:val="21"/>

</xml_diff>